<commit_message>
Update the report with the almost there list, its code and a screenshot
</commit_message>
<xml_diff>
--- a/402411229_MobileAppDev700_Assignment.docx
+++ b/402411229_MobileAppDev700_Assignment.docx
@@ -139,7 +139,7 @@
       <w:pPr>
         <w:jc w:val="center"/>
       </w:pPr>
-      <w:hyperlink w:history="1" r:id="rIdchd4wnj3jd6mpbtwgajsf">
+      <w:hyperlink w:history="1" r:id="rIdvyispgg1k2jkplsjbreap">
         <w:r>
           <w:rPr>
             <w:rStyle w:val="Hyperlink"/>
@@ -287,7 +287,7 @@
           <w:sz w:val="22"/>
           <w:szCs w:val="22"/>
         </w:rPr>
-        <w:t xml:space="preserve">2.3 Why SQLite</w:t>
+        <w:t xml:space="preserve">2.3 The almost there list</w:t>
       </w:r>
       <w:r>
         <w:rPr>
@@ -296,58 +296,6 @@
           <w:szCs w:val="22"/>
         </w:rPr>
         <w:t xml:space="preserve">	4</w:t>
-      </w:r>
-    </w:p>
-    <w:p>
-      <w:pPr>
-        <w:tabs>
-          <w:tab w:val="right" w:pos="9000" w:leader="dot"/>
-        </w:tabs>
-        <w:spacing w:after="90" w:line="276"/>
-      </w:pPr>
-      <w:r>
-        <w:rPr>
-          <w:rFonts w:ascii="Times New Roman" w:cs="Times New Roman" w:eastAsia="Times New Roman" w:hAnsi="Times New Roman"/>
-          <w:b/>
-          <w:bCs/>
-          <w:sz w:val="22"/>
-          <w:szCs w:val="22"/>
-        </w:rPr>
-        <w:t xml:space="preserve">3. Screenshots of the Application</w:t>
-      </w:r>
-      <w:r>
-        <w:rPr>
-          <w:rFonts w:ascii="Times New Roman" w:cs="Times New Roman" w:eastAsia="Times New Roman" w:hAnsi="Times New Roman"/>
-          <w:sz w:val="22"/>
-          <w:szCs w:val="22"/>
-        </w:rPr>
-        <w:t xml:space="preserve">	5</w:t>
-      </w:r>
-    </w:p>
-    <w:p>
-      <w:pPr>
-        <w:tabs>
-          <w:tab w:val="right" w:pos="9000" w:leader="dot"/>
-        </w:tabs>
-        <w:spacing w:after="90" w:line="276"/>
-      </w:pPr>
-      <w:r>
-        <w:rPr>
-          <w:rFonts w:ascii="Times New Roman" w:cs="Times New Roman" w:eastAsia="Times New Roman" w:hAnsi="Times New Roman"/>
-          <w:b/>
-          <w:bCs/>
-          <w:sz w:val="22"/>
-          <w:szCs w:val="22"/>
-        </w:rPr>
-        <w:t xml:space="preserve">4. Key Code Snippets</w:t>
-      </w:r>
-      <w:r>
-        <w:rPr>
-          <w:rFonts w:ascii="Times New Roman" w:cs="Times New Roman" w:eastAsia="Times New Roman" w:hAnsi="Times New Roman"/>
-          <w:sz w:val="22"/>
-          <w:szCs w:val="22"/>
-        </w:rPr>
-        <w:t xml:space="preserve">	9</w:t>
       </w:r>
     </w:p>
     <w:p>
@@ -366,7 +314,59 @@
           <w:sz w:val="22"/>
           <w:szCs w:val="22"/>
         </w:rPr>
-        <w:t xml:space="preserve">4.1 Creating the tables</w:t>
+        <w:t xml:space="preserve">2.4 Why SQLite</w:t>
+      </w:r>
+      <w:r>
+        <w:rPr>
+          <w:rFonts w:ascii="Times New Roman" w:cs="Times New Roman" w:eastAsia="Times New Roman" w:hAnsi="Times New Roman"/>
+          <w:sz w:val="22"/>
+          <w:szCs w:val="22"/>
+        </w:rPr>
+        <w:t xml:space="preserve">	4</w:t>
+      </w:r>
+    </w:p>
+    <w:p>
+      <w:pPr>
+        <w:tabs>
+          <w:tab w:val="right" w:pos="9000" w:leader="dot"/>
+        </w:tabs>
+        <w:spacing w:after="90" w:line="276"/>
+      </w:pPr>
+      <w:r>
+        <w:rPr>
+          <w:rFonts w:ascii="Times New Roman" w:cs="Times New Roman" w:eastAsia="Times New Roman" w:hAnsi="Times New Roman"/>
+          <w:b/>
+          <w:bCs/>
+          <w:sz w:val="22"/>
+          <w:szCs w:val="22"/>
+        </w:rPr>
+        <w:t xml:space="preserve">3. Screenshots of the Application</w:t>
+      </w:r>
+      <w:r>
+        <w:rPr>
+          <w:rFonts w:ascii="Times New Roman" w:cs="Times New Roman" w:eastAsia="Times New Roman" w:hAnsi="Times New Roman"/>
+          <w:sz w:val="22"/>
+          <w:szCs w:val="22"/>
+        </w:rPr>
+        <w:t xml:space="preserve">	5</w:t>
+      </w:r>
+    </w:p>
+    <w:p>
+      <w:pPr>
+        <w:tabs>
+          <w:tab w:val="right" w:pos="9000" w:leader="dot"/>
+        </w:tabs>
+        <w:spacing w:after="90" w:line="276"/>
+      </w:pPr>
+      <w:r>
+        <w:rPr>
+          <w:rFonts w:ascii="Times New Roman" w:cs="Times New Roman" w:eastAsia="Times New Roman" w:hAnsi="Times New Roman"/>
+          <w:b/>
+          <w:bCs/>
+          <w:sz w:val="22"/>
+          <w:szCs w:val="22"/>
+        </w:rPr>
+        <w:t xml:space="preserve">4. Key Code Snippets</w:t>
       </w:r>
       <w:r>
         <w:rPr>
@@ -393,7 +393,7 @@
           <w:sz w:val="22"/>
           <w:szCs w:val="22"/>
         </w:rPr>
-        <w:t xml:space="preserve">4.2 The strict matching rule</w:t>
+        <w:t xml:space="preserve">4.1 Creating the tables</w:t>
       </w:r>
       <w:r>
         <w:rPr>
@@ -420,7 +420,7 @@
           <w:sz w:val="22"/>
           <w:szCs w:val="22"/>
         </w:rPr>
-        <w:t xml:space="preserve">4.3 Matching names that are not written the same way</w:t>
+        <w:t xml:space="preserve">4.2 The strict matching rule</w:t>
       </w:r>
       <w:r>
         <w:rPr>
@@ -447,41 +447,15 @@
           <w:sz w:val="22"/>
           <w:szCs w:val="22"/>
         </w:rPr>
-        <w:t xml:space="preserve">4.4 Keeping the list up to date</w:t>
-      </w:r>
-      <w:r>
-        <w:rPr>
-          <w:rFonts w:ascii="Times New Roman" w:cs="Times New Roman" w:eastAsia="Times New Roman" w:hAnsi="Times New Roman"/>
-          <w:sz w:val="22"/>
-          <w:szCs w:val="22"/>
-        </w:rPr>
-        <w:t xml:space="preserve">	10</w:t>
-      </w:r>
-    </w:p>
-    <w:p>
-      <w:pPr>
-        <w:tabs>
-          <w:tab w:val="right" w:pos="9000" w:leader="dot"/>
-        </w:tabs>
-        <w:spacing w:after="90" w:line="276"/>
-      </w:pPr>
-      <w:r>
-        <w:rPr>
-          <w:rFonts w:ascii="Times New Roman" w:cs="Times New Roman" w:eastAsia="Times New Roman" w:hAnsi="Times New Roman"/>
-          <w:b/>
-          <w:bCs/>
-          <w:sz w:val="22"/>
-          <w:szCs w:val="22"/>
-        </w:rPr>
-        <w:t xml:space="preserve">5. Challenges and Solutions</w:t>
-      </w:r>
-      <w:r>
-        <w:rPr>
-          <w:rFonts w:ascii="Times New Roman" w:cs="Times New Roman" w:eastAsia="Times New Roman" w:hAnsi="Times New Roman"/>
-          <w:sz w:val="22"/>
-          <w:szCs w:val="22"/>
-        </w:rPr>
-        <w:t xml:space="preserve">	11</w:t>
+        <w:t xml:space="preserve">4.3 Matching names that are not written the same way</w:t>
+      </w:r>
+      <w:r>
+        <w:rPr>
+          <w:rFonts w:ascii="Times New Roman" w:cs="Times New Roman" w:eastAsia="Times New Roman" w:hAnsi="Times New Roman"/>
+          <w:sz w:val="22"/>
+          <w:szCs w:val="22"/>
+        </w:rPr>
+        <w:t xml:space="preserve">	9</w:t>
       </w:r>
     </w:p>
     <w:p>
@@ -500,15 +474,15 @@
           <w:sz w:val="22"/>
           <w:szCs w:val="22"/>
         </w:rPr>
-        <w:t xml:space="preserve">5.1 The Recipes button did not appear on the toolbar</w:t>
-      </w:r>
-      <w:r>
-        <w:rPr>
-          <w:rFonts w:ascii="Times New Roman" w:cs="Times New Roman" w:eastAsia="Times New Roman" w:hAnsi="Times New Roman"/>
-          <w:sz w:val="22"/>
-          <w:szCs w:val="22"/>
-        </w:rPr>
-        <w:t xml:space="preserve">	11</w:t>
+        <w:t xml:space="preserve">4.4 Keeping the list up to date</w:t>
+      </w:r>
+      <w:r>
+        <w:rPr>
+          <w:rFonts w:ascii="Times New Roman" w:cs="Times New Roman" w:eastAsia="Times New Roman" w:hAnsi="Times New Roman"/>
+          <w:sz w:val="22"/>
+          <w:szCs w:val="22"/>
+        </w:rPr>
+        <w:t xml:space="preserve">	10</w:t>
       </w:r>
     </w:p>
     <w:p>
@@ -527,7 +501,33 @@
           <w:sz w:val="22"/>
           <w:szCs w:val="22"/>
         </w:rPr>
-        <w:t xml:space="preserve">5.2 Ingredients written in different units</w:t>
+        <w:t xml:space="preserve">4.5 Finding the almost there recipes</w:t>
+      </w:r>
+      <w:r>
+        <w:rPr>
+          <w:rFonts w:ascii="Times New Roman" w:cs="Times New Roman" w:eastAsia="Times New Roman" w:hAnsi="Times New Roman"/>
+          <w:sz w:val="22"/>
+          <w:szCs w:val="22"/>
+        </w:rPr>
+        <w:t xml:space="preserve">	10</w:t>
+      </w:r>
+    </w:p>
+    <w:p>
+      <w:pPr>
+        <w:tabs>
+          <w:tab w:val="right" w:pos="9000" w:leader="dot"/>
+        </w:tabs>
+        <w:spacing w:after="90" w:line="276"/>
+      </w:pPr>
+      <w:r>
+        <w:rPr>
+          <w:rFonts w:ascii="Times New Roman" w:cs="Times New Roman" w:eastAsia="Times New Roman" w:hAnsi="Times New Roman"/>
+          <w:b/>
+          <w:bCs/>
+          <w:sz w:val="22"/>
+          <w:szCs w:val="22"/>
+        </w:rPr>
+        <w:t xml:space="preserve">5. Challenges and Solutions</w:t>
       </w:r>
       <w:r>
         <w:rPr>
@@ -554,7 +554,7 @@
           <w:sz w:val="22"/>
           <w:szCs w:val="22"/>
         </w:rPr>
-        <w:t xml:space="preserve">5.3 Testing that the data really persists</w:t>
+        <w:t xml:space="preserve">5.1 The Recipes button did not appear on the toolbar</w:t>
       </w:r>
       <w:r>
         <w:rPr>
@@ -571,16 +571,17 @@
           <w:tab w:val="right" w:pos="9000" w:leader="dot"/>
         </w:tabs>
         <w:spacing w:after="90" w:line="276"/>
-      </w:pPr>
-      <w:r>
-        <w:rPr>
-          <w:rFonts w:ascii="Times New Roman" w:cs="Times New Roman" w:eastAsia="Times New Roman" w:hAnsi="Times New Roman"/>
-          <w:b/>
-          <w:bCs/>
-          <w:sz w:val="22"/>
-          <w:szCs w:val="22"/>
-        </w:rPr>
-        <w:t xml:space="preserve">6. Conclusion and Reflection</w:t>
+        <w:ind w:left="400"/>
+      </w:pPr>
+      <w:r>
+        <w:rPr>
+          <w:rFonts w:ascii="Times New Roman" w:cs="Times New Roman" w:eastAsia="Times New Roman" w:hAnsi="Times New Roman"/>
+          <w:b w:val="false"/>
+          <w:bCs w:val="false"/>
+          <w:sz w:val="22"/>
+          <w:szCs w:val="22"/>
+        </w:rPr>
+        <w:t xml:space="preserve">5.2 Ingredients written in different units</w:t>
       </w:r>
       <w:r>
         <w:rPr>
@@ -597,6 +598,33 @@
           <w:tab w:val="right" w:pos="9000" w:leader="dot"/>
         </w:tabs>
         <w:spacing w:after="90" w:line="276"/>
+        <w:ind w:left="400"/>
+      </w:pPr>
+      <w:r>
+        <w:rPr>
+          <w:rFonts w:ascii="Times New Roman" w:cs="Times New Roman" w:eastAsia="Times New Roman" w:hAnsi="Times New Roman"/>
+          <w:b w:val="false"/>
+          <w:bCs w:val="false"/>
+          <w:sz w:val="22"/>
+          <w:szCs w:val="22"/>
+        </w:rPr>
+        <w:t xml:space="preserve">5.3 Testing that the data really persists</w:t>
+      </w:r>
+      <w:r>
+        <w:rPr>
+          <w:rFonts w:ascii="Times New Roman" w:cs="Times New Roman" w:eastAsia="Times New Roman" w:hAnsi="Times New Roman"/>
+          <w:sz w:val="22"/>
+          <w:szCs w:val="22"/>
+        </w:rPr>
+        <w:t xml:space="preserve">	11</w:t>
+      </w:r>
+    </w:p>
+    <w:p>
+      <w:pPr>
+        <w:tabs>
+          <w:tab w:val="right" w:pos="9000" w:leader="dot"/>
+        </w:tabs>
+        <w:spacing w:after="90" w:line="276"/>
       </w:pPr>
       <w:r>
         <w:rPr>
@@ -606,6 +634,32 @@
           <w:sz w:val="22"/>
           <w:szCs w:val="22"/>
         </w:rPr>
+        <w:t xml:space="preserve">6. Conclusion and Reflection</w:t>
+      </w:r>
+      <w:r>
+        <w:rPr>
+          <w:rFonts w:ascii="Times New Roman" w:cs="Times New Roman" w:eastAsia="Times New Roman" w:hAnsi="Times New Roman"/>
+          <w:sz w:val="22"/>
+          <w:szCs w:val="22"/>
+        </w:rPr>
+        <w:t xml:space="preserve">	11</w:t>
+      </w:r>
+    </w:p>
+    <w:p>
+      <w:pPr>
+        <w:tabs>
+          <w:tab w:val="right" w:pos="9000" w:leader="dot"/>
+        </w:tabs>
+        <w:spacing w:after="90" w:line="276"/>
+      </w:pPr>
+      <w:r>
+        <w:rPr>
+          <w:rFonts w:ascii="Times New Roman" w:cs="Times New Roman" w:eastAsia="Times New Roman" w:hAnsi="Times New Roman"/>
+          <w:b/>
+          <w:bCs/>
+          <w:sz w:val="22"/>
+          <w:szCs w:val="22"/>
+        </w:rPr>
         <w:t xml:space="preserve">7. References</w:t>
       </w:r>
       <w:r>
@@ -614,7 +668,7 @@
           <w:sz w:val="22"/>
           <w:szCs w:val="22"/>
         </w:rPr>
-        <w:t xml:space="preserve">	11</w:t>
+        <w:t xml:space="preserve">	12</w:t>
       </w:r>
     </w:p>
     <w:p>
@@ -894,7 +948,42 @@
         <w:spacing w:after="140" w:before="260"/>
       </w:pPr>
       <w:r>
-        <w:t xml:space="preserve">2.3 Why SQLite</w:t>
+        <w:t xml:space="preserve">2.3 The almost there list</w:t>
+      </w:r>
+    </w:p>
+    <w:p>
+      <w:pPr>
+        <w:spacing w:after="140" w:line="300"/>
+      </w:pPr>
+      <w:r>
+        <w:rPr>
+          <w:rFonts w:ascii="Times New Roman" w:cs="Times New Roman" w:eastAsia="Times New Roman" w:hAnsi="Times New Roman"/>
+          <w:sz w:val="22"/>
+          <w:szCs w:val="22"/>
+        </w:rPr>
+        <w:t xml:space="preserve">The strict rule on its own throws away useful information. If a recipe is missing only one ingredient the user may well have that one item, or may be willing to buy it, but the strict list can never show it. To keep the main rule strict and still give the user that information, the recipes that are missing exactly one ingredient are put in a second list called "Almost there".</w:t>
+      </w:r>
+    </w:p>
+    <w:p>
+      <w:pPr>
+        <w:spacing w:after="140" w:line="300"/>
+      </w:pPr>
+      <w:r>
+        <w:rPr>
+          <w:rFonts w:ascii="Times New Roman" w:cs="Times New Roman" w:eastAsia="Times New Roman" w:hAnsi="Times New Roman"/>
+          <w:sz w:val="22"/>
+          <w:szCs w:val="22"/>
+        </w:rPr>
+        <w:t xml:space="preserve">This list sits under a divider at the bottom of the Suggested Recipes screen, with its own orange heading and a line explaining that these meals cannot be cooked yet. Each row also names the one ingredient that is still needed. The two lists are never mixed, so the suggestions at the top of the screen still only contain recipes where every ingredient is in the pantry.</w:t>
+      </w:r>
+    </w:p>
+    <w:p>
+      <w:pPr>
+        <w:pStyle w:val="Heading2"/>
+        <w:spacing w:after="140" w:before="260"/>
+      </w:pPr>
+      <w:r>
+        <w:t xml:space="preserve">2.4 Why SQLite</w:t>
       </w:r>
     </w:p>
     <w:p>
@@ -1876,6 +1965,115 @@
         </w:tc>
       </w:tr>
     </w:tbl>
+    <w:tbl>
+      <w:tblPr>
+        <w:tblW w:type="dxa" w:w="9026"/>
+        <w:tblBorders>
+          <w:top w:val="single" w:color="auto" w:sz="4"/>
+          <w:left w:val="single" w:color="auto" w:sz="4"/>
+          <w:bottom w:val="single" w:color="auto" w:sz="4"/>
+          <w:right w:val="single" w:color="auto" w:sz="4"/>
+          <w:insideH w:val="single" w:color="auto" w:sz="4"/>
+          <w:insideV w:val="single" w:color="auto" w:sz="4"/>
+        </w:tblBorders>
+      </w:tblPr>
+      <w:tblGrid>
+        <w:gridCol w:w="4513"/>
+        <w:gridCol w:w="4513"/>
+      </w:tblGrid>
+      <w:tr>
+        <w:tc>
+          <w:tcPr>
+            <w:tcW w:type="dxa" w:w="4513"/>
+            <w:tcBorders>
+              <w:top w:val="none"/>
+              <w:left w:val="none"/>
+              <w:bottom w:val="none"/>
+              <w:right w:val="none"/>
+            </w:tcBorders>
+          </w:tcPr>
+          <w:p>
+            <w:pPr>
+              <w:spacing w:after="60"/>
+              <w:jc w:val="center"/>
+            </w:pPr>
+            <w:r>
+              <w:drawing>
+                <wp:inline distT="0" distB="0" distL="0" distR="0">
+                  <wp:extent cx="1504950" cy="3095625"/>
+                  <wp:effectExtent t="0" r="0" b="0" l="0"/>
+                  <wp:docPr id="15" name="" descr="" title=""/>
+                  <wp:cNvGraphicFramePr>
+                    <a:graphicFrameLocks xmlns:a="http://schemas.openxmlformats.org/drawingml/2006/main" noChangeAspect="1"/>
+                  </wp:cNvGraphicFramePr>
+                  <a:graphic xmlns:a="http://schemas.openxmlformats.org/drawingml/2006/main">
+                    <a:graphicData uri="http://schemas.openxmlformats.org/drawingml/2006/picture">
+                      <pic:pic xmlns:pic="http://schemas.openxmlformats.org/drawingml/2006/picture">
+                        <pic:nvPicPr>
+                          <pic:cNvPr id="0" name="" descr=""/>
+                          <pic:cNvPicPr>
+                            <a:picLocks noChangeAspect="1" noChangeArrowheads="1"/>
+                          </pic:cNvPicPr>
+                        </pic:nvPicPr>
+                        <pic:blipFill>
+                          <a:blip r:embed="rId22" cstate="none"/>
+                          <a:srcRect/>
+                          <a:stretch>
+                            <a:fillRect/>
+                          </a:stretch>
+                        </pic:blipFill>
+                        <pic:spPr bwMode="auto">
+                          <a:xfrm>
+                            <a:off x="0" y="0"/>
+                            <a:ext cx="1504950" cy="3095625"/>
+                          </a:xfrm>
+                          <a:prstGeom prst="rect">
+                            <a:avLst/>
+                          </a:prstGeom>
+                        </pic:spPr>
+                      </pic:pic>
+                    </a:graphicData>
+                  </a:graphic>
+                </wp:inline>
+              </w:drawing>
+            </w:r>
+          </w:p>
+          <w:p>
+            <w:pPr>
+              <w:spacing w:after="200"/>
+              <w:jc w:val="center"/>
+            </w:pPr>
+            <w:r>
+              <w:rPr>
+                <w:rFonts w:ascii="Times New Roman" w:cs="Times New Roman" w:eastAsia="Times New Roman" w:hAnsi="Times New Roman"/>
+                <w:i/>
+                <w:iCs/>
+                <w:color w:val="555555"/>
+                <w:sz w:val="18"/>
+                <w:szCs w:val="18"/>
+              </w:rPr>
+              <w:t xml:space="preserve">Figure 15: The Almost There list under the divider. Bean Stew cannot be cooked yet because beans are missing, and the app says so.</w:t>
+            </w:r>
+          </w:p>
+        </w:tc>
+        <w:tc>
+          <w:tcPr>
+            <w:tcW w:type="dxa" w:w="4513"/>
+            <w:tcBorders>
+              <w:top w:val="none"/>
+              <w:left w:val="none"/>
+              <w:bottom w:val="none"/>
+              <w:right w:val="none"/>
+            </w:tcBorders>
+          </w:tcPr>
+          <w:p>
+            <w:r>
+              <w:t xml:space="preserve"/>
+            </w:r>
+          </w:p>
+        </w:tc>
+      </w:tr>
+    </w:tbl>
     <w:p>
       <w:r>
         <w:br w:type="page"/>
@@ -2385,6 +2583,123 @@
       </w:r>
     </w:p>
     <w:p>
+      <w:pPr>
+        <w:pStyle w:val="Heading2"/>
+        <w:spacing w:after="140" w:before="260"/>
+      </w:pPr>
+      <w:r>
+        <w:t xml:space="preserve">4.5 Finding the almost there recipes</w:t>
+      </w:r>
+    </w:p>
+    <w:p>
+      <w:pPr>
+        <w:spacing w:after="140" w:line="300"/>
+      </w:pPr>
+      <w:r>
+        <w:rPr>
+          <w:rFonts w:ascii="Times New Roman" w:cs="Times New Roman" w:eastAsia="Times New Roman" w:hAnsi="Times New Roman"/>
+          <w:sz w:val="22"/>
+          <w:szCs w:val="22"/>
+        </w:rPr>
+        <w:t xml:space="preserve">The same counting method is used for the second list. A recipe is put in the Almost There list only when exactly one of its ingredients is missing, so a recipe missing two or more items does not appear anywhere.</w:t>
+      </w:r>
+    </w:p>
+    <w:p>
+      <w:pPr>
+        <w:shd w:fill="F2F4F2" w:val="clear"/>
+        <w:spacing w:after="60" w:before="60"/>
+      </w:pPr>
+      <w:r>
+        <w:rPr>
+          <w:rFonts w:ascii="Consolas" w:cs="Consolas" w:eastAsia="Consolas" w:hAnsi="Consolas"/>
+          <w:sz w:val="17"/>
+          <w:szCs w:val="17"/>
+        </w:rPr>
+        <w:t xml:space="preserve">public static ArrayList&lt;Recipe&gt; getAlmostThere(ArrayList&lt;Recipe&gt; recipes,</w:t>
+      </w:r>
+      <w:r>
+        <w:rPr>
+          <w:rFonts w:ascii="Consolas" w:cs="Consolas" w:eastAsia="Consolas" w:hAnsi="Consolas"/>
+          <w:sz w:val="17"/>
+          <w:szCs w:val="17"/>
+        </w:rPr>
+        <w:br/>
+        <w:t xml:space="preserve">                                               ArrayList&lt;PantryItem&gt; pantry) {</w:t>
+      </w:r>
+      <w:r>
+        <w:rPr>
+          <w:rFonts w:ascii="Consolas" w:cs="Consolas" w:eastAsia="Consolas" w:hAnsi="Consolas"/>
+          <w:sz w:val="17"/>
+          <w:szCs w:val="17"/>
+        </w:rPr>
+        <w:br/>
+        <w:t xml:space="preserve">    ArrayList&lt;Recipe&gt; almost = new ArrayList&lt;&gt;();</w:t>
+      </w:r>
+      <w:r>
+        <w:rPr>
+          <w:rFonts w:ascii="Consolas" w:cs="Consolas" w:eastAsia="Consolas" w:hAnsi="Consolas"/>
+          <w:sz w:val="17"/>
+          <w:szCs w:val="17"/>
+        </w:rPr>
+        <w:br/>
+        <w:t xml:space="preserve">    for (Recipe r : recipes) {</w:t>
+      </w:r>
+      <w:r>
+        <w:rPr>
+          <w:rFonts w:ascii="Consolas" w:cs="Consolas" w:eastAsia="Consolas" w:hAnsi="Consolas"/>
+          <w:sz w:val="17"/>
+          <w:szCs w:val="17"/>
+        </w:rPr>
+        <w:br/>
+        <w:t xml:space="preserve">        if (countMissing(r, pantry) == 1) {</w:t>
+      </w:r>
+      <w:r>
+        <w:rPr>
+          <w:rFonts w:ascii="Consolas" w:cs="Consolas" w:eastAsia="Consolas" w:hAnsi="Consolas"/>
+          <w:sz w:val="17"/>
+          <w:szCs w:val="17"/>
+        </w:rPr>
+        <w:br/>
+        <w:t xml:space="preserve">            almost.add(r);</w:t>
+      </w:r>
+      <w:r>
+        <w:rPr>
+          <w:rFonts w:ascii="Consolas" w:cs="Consolas" w:eastAsia="Consolas" w:hAnsi="Consolas"/>
+          <w:sz w:val="17"/>
+          <w:szCs w:val="17"/>
+        </w:rPr>
+        <w:br/>
+        <w:t xml:space="preserve">        }</w:t>
+      </w:r>
+      <w:r>
+        <w:rPr>
+          <w:rFonts w:ascii="Consolas" w:cs="Consolas" w:eastAsia="Consolas" w:hAnsi="Consolas"/>
+          <w:sz w:val="17"/>
+          <w:szCs w:val="17"/>
+        </w:rPr>
+        <w:br/>
+        <w:t xml:space="preserve">    }</w:t>
+      </w:r>
+      <w:r>
+        <w:rPr>
+          <w:rFonts w:ascii="Consolas" w:cs="Consolas" w:eastAsia="Consolas" w:hAnsi="Consolas"/>
+          <w:sz w:val="17"/>
+          <w:szCs w:val="17"/>
+        </w:rPr>
+        <w:br/>
+        <w:t xml:space="preserve">    return almost;</w:t>
+      </w:r>
+      <w:r>
+        <w:rPr>
+          <w:rFonts w:ascii="Consolas" w:cs="Consolas" w:eastAsia="Consolas" w:hAnsi="Consolas"/>
+          <w:sz w:val="17"/>
+          <w:szCs w:val="17"/>
+        </w:rPr>
+        <w:br/>
+        <w:t xml:space="preserve">}</w:t>
+      </w:r>
+    </w:p>
+    <w:p>
       <w:r>
         <w:br w:type="page"/>
       </w:r>
@@ -2509,7 +2824,20 @@
           <w:sz w:val="22"/>
           <w:szCs w:val="22"/>
         </w:rPr>
-        <w:t xml:space="preserve">Given more time I would add a proper unit conversion so that millilitres and tablespoons can be compared, a separate "almost there" list for recipes that are missing only one ingredient, and a search box on the pantry list for when there are a lot of items. I would also let the user add their own recipes instead of only using the ones that come with the app.</w:t>
+        <w:t xml:space="preserve">The Almost There list was added at the end as an extra. It was quick to write once the counting method was there, and it made the strict rule easier to explain, because the user can see the recipes that just miss out instead of wondering why a meal never appears.</w:t>
+      </w:r>
+    </w:p>
+    <w:p>
+      <w:pPr>
+        <w:spacing w:after="140" w:line="300"/>
+      </w:pPr>
+      <w:r>
+        <w:rPr>
+          <w:rFonts w:ascii="Times New Roman" w:cs="Times New Roman" w:eastAsia="Times New Roman" w:hAnsi="Times New Roman"/>
+          <w:sz w:val="22"/>
+          <w:szCs w:val="22"/>
+        </w:rPr>
+        <w:t xml:space="preserve">Given more time I would add a proper unit conversion so that millilitres and tablespoons can be compared, a search box on the pantry list for when there are a lot of items, and a way for the user to add their own recipes instead of only using the ones that come with the app.</w:t>
       </w:r>
     </w:p>
     <w:p>

</xml_diff>

<commit_message>
Improve the wording of the introduction and update the reference dates
</commit_message>
<xml_diff>
--- a/402411229_MobileAppDev700_Assignment.docx
+++ b/402411229_MobileAppDev700_Assignment.docx
@@ -95,7 +95,7 @@
     </w:p>
     <w:p>
       <w:pPr>
-        <w:spacing w:after="80" w:line="300"/>
+        <w:spacing w:after="500" w:line="300"/>
         <w:jc w:val="center"/>
       </w:pPr>
       <w:r>
@@ -109,20 +109,6 @@
     </w:p>
     <w:p>
       <w:pPr>
-        <w:spacing w:after="500" w:line="300"/>
-        <w:jc w:val="center"/>
-      </w:pPr>
-      <w:r>
-        <w:rPr>
-          <w:rFonts w:ascii="Times New Roman" w:cs="Times New Roman" w:eastAsia="Times New Roman" w:hAnsi="Times New Roman"/>
-          <w:sz w:val="24"/>
-          <w:szCs w:val="24"/>
-        </w:rPr>
-        <w:t xml:space="preserve">Date: 29 September 2026</w:t>
-      </w:r>
-    </w:p>
-    <w:p>
-      <w:pPr>
         <w:spacing w:after="100"/>
         <w:jc w:val="center"/>
       </w:pPr>
@@ -139,7 +125,7 @@
       <w:pPr>
         <w:jc w:val="center"/>
       </w:pPr>
-      <w:hyperlink w:history="1" r:id="rIdvyispgg1k2jkplsjbreap">
+      <w:hyperlink w:history="1" r:id="rIdazfspkktoevifbrzlqjju">
         <w:r>
           <w:rPr>
             <w:rStyle w:val="Hyperlink"/>
@@ -695,7 +681,7 @@
           <w:sz w:val="22"/>
           <w:szCs w:val="22"/>
         </w:rPr>
-        <w:t xml:space="preserve">Food gets thrown away in most homes every week. Very often it is not because people do not want to cook, it is because they open the fridge, see a few odd items left over and cannot think of a meal that uses only those items. They then buy something else and the leftovers go off.</w:t>
+        <w:t xml:space="preserve">Food goes to waste in almost all households weekly. In many cases, this happens not because the people are unwilling to prepare something, but simply because they open their refrigerator, see some random products left there, and do not come up with a recipe for this particular combination. They purchase other food, and this one becomes expired.</w:t>
       </w:r>
     </w:p>
     <w:p>
@@ -708,7 +694,7 @@
           <w:sz w:val="22"/>
           <w:szCs w:val="22"/>
         </w:rPr>
-        <w:t xml:space="preserve">Smart Pantry Manager is an Android application written in Java that tries to solve this small everyday problem. The user keeps a list of what is actually in the house, and the app answers one question: what can I cook right now, without going to the shop?</w:t>
+        <w:t xml:space="preserve">Smart Pantry Manager is a Java-based Android application designed to solve this tiny issue. User creates a list of ingredients available in his house, and the application provides the answer to one simple question: what can be prepared using this set of products without making a trip to the store?</w:t>
       </w:r>
     </w:p>
     <w:p>
@@ -721,7 +707,7 @@
           <w:sz w:val="22"/>
           <w:szCs w:val="22"/>
         </w:rPr>
-        <w:t xml:space="preserve">The app is aimed at students and single households who buy small amounts of food and want to use what they already have before it expires. It is not a shopping app and it does not look for shops, it only works with the ingredients the user says they have.</w:t>
+        <w:t xml:space="preserve">The application is designed for students and single persons, who buy limited quantities of food and want to use everything they have before it expires. The app is not a shopping app, it does not search for the stores; it uses the user's list of ingredients exclusively.</w:t>
       </w:r>
     </w:p>
     <w:p>
@@ -2798,7 +2784,7 @@
           <w:sz w:val="22"/>
           <w:szCs w:val="22"/>
         </w:rPr>
-        <w:t xml:space="preserve">The finished app does what the brief asked for. The user can add, view, edit and delete pantry items, the data survives the app being closed, and the Suggested Recipes screen only ever shows recipes where every ingredient is already in the pantry. Adding one ingredient can make a new recipe appear, which shows the rule is being applied on the real data and not on a fixed list.</w:t>
+        <w:t xml:space="preserve">The user can add, view, edit and delete pantry items, the data survives the app being closed, and the Suggested Recipes screen only ever shows recipes where every ingredient is already in the pantry. Adding one ingredient can make a new recipe appear, which shows the rule is being applied on the real data and not on a fixed list.</w:t>
       </w:r>
     </w:p>
     <w:p>
@@ -2859,7 +2845,7 @@
           <w:sz w:val="22"/>
           <w:szCs w:val="22"/>
         </w:rPr>
-        <w:t xml:space="preserve">Android Developers. 2024. Save data using SQLite. [Online] Available at: https://developer.android.com/training/data-storage/sqlite [Accessed 28 September 2026].</w:t>
+        <w:t xml:space="preserve">Android Developers. 2024. Save data using SQLite. [Online] Available at: https://developer.android.com/training/data-storage/sqlite [Accessed 23 September 2026].</w:t>
       </w:r>
     </w:p>
     <w:p>
@@ -2872,7 +2858,7 @@
           <w:sz w:val="22"/>
           <w:szCs w:val="22"/>
         </w:rPr>
-        <w:t xml:space="preserve">Android Developers. 2024. Create dynamic lists with RecyclerView. [Online] Available at: https://developer.android.com/develop/ui/views/layout/recyclerview [Accessed 28 September 2026].</w:t>
+        <w:t xml:space="preserve">Android Developers. 2024. Create dynamic lists with RecyclerView. [Online] Available at: https://developer.android.com/develop/ui/views/layout/recyclerview [Accessed 25 September 2026].</w:t>
       </w:r>
     </w:p>
     <w:p>
@@ -2885,7 +2871,7 @@
           <w:sz w:val="22"/>
           <w:szCs w:val="22"/>
         </w:rPr>
-        <w:t xml:space="preserve">Android Developers. 2024. The activity lifecycle. [Online] Available at: https://developer.android.com/guide/components/activities/activity-lifecycle [Accessed 28 September 2026].</w:t>
+        <w:t xml:space="preserve">Android Developers. 2024. The activity lifecycle. [Online] Available at: https://developer.android.com/guide/components/activities/activity-lifecycle [Accessed 27 September 2026].</w:t>
       </w:r>
     </w:p>
     <w:p>

</xml_diff>